<commit_message>
Describe your changes here
</commit_message>
<xml_diff>
--- a/results.docx
+++ b/results.docx
@@ -147,6 +147,174 @@
           <w:lang w:val="en-US"/>
         </w:rPr>
         <w:t>Mean reward per env (averaged over episodes): 14.528</w:t>
+      </w:r>
+    </w:p>
+    <w:p>
+      <w:pPr>
+        <w:pStyle w:val="Normal"/>
+        <w:rPr>
+          <w:b w:val="false"/>
+          <w:b w:val="false"/>
+          <w:bCs w:val="false"/>
+          <w:sz w:val="24"/>
+          <w:szCs w:val="24"/>
+          <w:highlight w:val="none"/>
+          <w:shd w:fill="auto" w:val="clear"/>
+        </w:rPr>
+      </w:pPr>
+      <w:r>
+        <w:rPr>
+          <w:b w:val="false"/>
+          <w:bCs w:val="false"/>
+          <w:sz w:val="24"/>
+          <w:szCs w:val="24"/>
+          <w:shd w:fill="auto" w:val="clear"/>
+        </w:rPr>
+      </w:r>
+    </w:p>
+    <w:p>
+      <w:pPr>
+        <w:pStyle w:val="Normal"/>
+        <w:rPr>
+          <w:b w:val="false"/>
+          <w:b w:val="false"/>
+          <w:bCs w:val="false"/>
+          <w:sz w:val="30"/>
+          <w:szCs w:val="30"/>
+          <w:highlight w:val="none"/>
+          <w:shd w:fill="auto" w:val="clear"/>
+        </w:rPr>
+      </w:pPr>
+      <w:r>
+        <w:rPr>
+          <w:b/>
+          <w:bCs/>
+          <w:sz w:val="30"/>
+          <w:szCs w:val="30"/>
+          <w:shd w:fill="auto" w:val="clear"/>
+          <w:lang w:val="en-US"/>
+        </w:rPr>
+        <w:t>Audio two sounds</w:t>
+      </w:r>
+    </w:p>
+    <w:p>
+      <w:pPr>
+        <w:pStyle w:val="Normal"/>
+        <w:rPr>
+          <w:b w:val="false"/>
+          <w:b w:val="false"/>
+          <w:bCs w:val="false"/>
+          <w:sz w:val="24"/>
+          <w:szCs w:val="24"/>
+          <w:highlight w:val="none"/>
+          <w:shd w:fill="auto" w:val="clear"/>
+        </w:rPr>
+      </w:pPr>
+      <w:r>
+        <w:rPr>
+          <w:b w:val="false"/>
+          <w:bCs w:val="false"/>
+          <w:sz w:val="24"/>
+          <w:szCs w:val="24"/>
+          <w:shd w:fill="auto" w:val="clear"/>
+        </w:rPr>
+        <w:t>=== Inference Summary ===</w:t>
+      </w:r>
+    </w:p>
+    <w:p>
+      <w:pPr>
+        <w:pStyle w:val="Normal"/>
+        <w:rPr>
+          <w:b w:val="false"/>
+          <w:b w:val="false"/>
+          <w:bCs w:val="false"/>
+          <w:sz w:val="24"/>
+          <w:szCs w:val="24"/>
+          <w:highlight w:val="none"/>
+          <w:shd w:fill="auto" w:val="clear"/>
+        </w:rPr>
+      </w:pPr>
+      <w:r>
+        <w:rPr>
+          <w:b w:val="false"/>
+          <w:bCs w:val="false"/>
+          <w:sz w:val="24"/>
+          <w:szCs w:val="24"/>
+          <w:shd w:fill="auto" w:val="clear"/>
+        </w:rPr>
+        <w:t>Episodes: 100 | Envs: 1 | Attempts: 100</w:t>
+      </w:r>
+    </w:p>
+    <w:p>
+      <w:pPr>
+        <w:pStyle w:val="Normal"/>
+        <w:rPr>
+          <w:b w:val="false"/>
+          <w:b w:val="false"/>
+          <w:bCs w:val="false"/>
+          <w:sz w:val="24"/>
+          <w:szCs w:val="24"/>
+          <w:highlight w:val="none"/>
+          <w:shd w:fill="auto" w:val="clear"/>
+        </w:rPr>
+      </w:pPr>
+      <w:r>
+        <w:rPr>
+          <w:b w:val="false"/>
+          <w:bCs w:val="false"/>
+          <w:sz w:val="24"/>
+          <w:szCs w:val="24"/>
+          <w:shd w:fill="auto" w:val="clear"/>
+        </w:rPr>
+        <w:t>Reached 30cm: 43/100 (43.0%)</w:t>
+      </w:r>
+    </w:p>
+    <w:p>
+      <w:pPr>
+        <w:pStyle w:val="Normal"/>
+        <w:rPr>
+          <w:b w:val="false"/>
+          <w:b w:val="false"/>
+          <w:bCs w:val="false"/>
+          <w:sz w:val="24"/>
+          <w:szCs w:val="24"/>
+          <w:highlight w:val="none"/>
+          <w:shd w:fill="auto" w:val="clear"/>
+        </w:rPr>
+      </w:pPr>
+      <w:r>
+        <w:rPr>
+          <w:b w:val="false"/>
+          <w:bCs w:val="false"/>
+          <w:sz w:val="24"/>
+          <w:szCs w:val="24"/>
+          <w:shd w:fill="auto" w:val="clear"/>
+        </w:rPr>
+        <w:t>Avg steps-to-30cm over all successes: 41.8</w:t>
+      </w:r>
+    </w:p>
+    <w:p>
+      <w:pPr>
+        <w:pStyle w:val="Normal"/>
+        <w:rPr>
+          <w:b w:val="false"/>
+          <w:b w:val="false"/>
+          <w:bCs w:val="false"/>
+          <w:sz w:val="24"/>
+          <w:szCs w:val="24"/>
+          <w:highlight w:val="none"/>
+          <w:shd w:fill="auto" w:val="clear"/>
+        </w:rPr>
+      </w:pPr>
+      <w:r>
+        <w:rPr>
+          <w:b w:val="false"/>
+          <w:bCs w:val="false"/>
+          <w:sz w:val="24"/>
+          <w:szCs w:val="24"/>
+          <w:shd w:fill="auto" w:val="clear"/>
+        </w:rPr>
+        <w:t>Mean reward per env (averaged over episodes): 17.434</w:t>
       </w:r>
     </w:p>
     <w:p>

</xml_diff>